<commit_message>
update 30 sep 2026
</commit_message>
<xml_diff>
--- a/CV Writing/Nafiur Rahman Sabbir CV with photo.docx
+++ b/CV Writing/Nafiur Rahman Sabbir CV with photo.docx
@@ -2534,10 +2534,20 @@
       <w:r>
         <w:rPr>
           <w:rFonts w:ascii="Calibri" w:hAnsi="Calibri" w:cs="Calibri"/>
-          <w:sz w:val="20"/>
-          <w:szCs w:val="20"/>
-        </w:rPr>
-        <w:t>Tech Stack: Flutter, Dart, OpenWeather API, Geolocator, Flutter Map, LatLong.</w:t>
+          <w:b/>
+          <w:bCs/>
+          <w:sz w:val="20"/>
+          <w:szCs w:val="20"/>
+        </w:rPr>
+        <w:t>Tech Stack:</w:t>
+      </w:r>
+      <w:r>
+        <w:rPr>
+          <w:rFonts w:ascii="Calibri" w:hAnsi="Calibri" w:cs="Calibri"/>
+          <w:sz w:val="20"/>
+          <w:szCs w:val="20"/>
+        </w:rPr>
+        <w:t xml:space="preserve"> Flutter, Dart, OpenWeather API, Geolocator, Flutter Map, LatLong.</w:t>
       </w:r>
     </w:p>
     <w:p>

</xml_diff>